<commit_message>
Rehace la plantilla de Word en versión sobria con 10 páginas tipo
Sin subrayados ni cajas verdes; dos portadas nuevas, índice, separador,
páginas de texto, tabla, infografía, listas e imágenes, y contraportada.

Co-Authored-By: Claude Opus 5.5 <noreply@anthropic.com>
Claude-Session: https://claude.ai/code/session_01VgtpFgEc7N9EFi63NUqpEw
</commit_message>
<xml_diff>
--- a/plantillas/word/Documento_en_blanco_Santiago_Ways.docx
+++ b/plantillas/word/Documento_en_blanco_Santiago_Ways.docx
@@ -9,7 +9,7 @@
       <w:r>
         <w:drawing>
           <wp:inline distT="0" distB="0" distL="0" distR="0">
-            <wp:extent cx="2381250" cy="381000"/>
+            <wp:extent cx="1905000" cy="304800"/>
             <wp:effectExtent t="0" r="0" b="0" l="0"/>
             <wp:docPr id="1" name=""/>
             <wp:cNvGraphicFramePr>
@@ -34,7 +34,7 @@
                   <pic:spPr bwMode="auto">
                     <a:xfrm>
                       <a:off x="0" y="0"/>
-                      <a:ext cx="2381250" cy="381000"/>
+                      <a:ext cx="1905000" cy="304800"/>
                     </a:xfrm>
                     <a:prstGeom prst="rect">
                       <a:avLst/>
@@ -49,180 +49,55 @@
     </w:p>
     <w:p>
       <w:pPr>
-        <w:pStyle w:val="Antetitulo"/>
-        <w:spacing w:before="3000"/>
+        <w:spacing w:after="0" w:before="5400" w:line="240" w:lineRule="auto"/>
       </w:pPr>
       <w:r>
-        <w:t xml:space="preserve">Tipo de documento · 2027</w:t>
+        <w:rPr>
+          <w:sz w:val="4"/>
+          <w:szCs w:val="4"/>
+        </w:rPr>
+        <w:t xml:space="preserve"/>
       </w:r>
     </w:p>
     <w:p>
       <w:pPr>
-        <w:pStyle w:val="Title"/>
+        <w:pBdr>
+          <w:bottom w:val="single" w:color="7AA606" w:sz="18" w:space="0"/>
+        </w:pBdr>
+        <w:spacing w:after="280" w:before="0" w:line="120" w:lineRule="exact"/>
+        <w:ind w:right="8390"/>
+      </w:pPr>
+    </w:p>
+    <w:p>
+      <w:pPr>
+        <w:pStyle w:val="Antetitulo"/>
       </w:pPr>
       <w:r>
-        <w:t xml:space="preserve">Título del </w:t>
-      </w:r>
-      <w:r>
-        <w:rPr>
-          <w:color w:val="FFFFFF"/>
-          <w:shd w:fill="7AA606" w:color="auto" w:val="clear"/>
-        </w:rPr>
-        <w:t xml:space="preserve"> documento </w:t>
+        <w:t xml:space="preserve">Informe · 2027</w:t>
       </w:r>
     </w:p>
     <w:p>
       <w:pPr>
-        <w:pStyle w:val="Subtitulo"/>
+        <w:pStyle w:val="Title"/>
       </w:pPr>
       <w:r>
-        <w:t xml:space="preserve">Subtítulo o descripción breve del documento en una o dos líneas.</w:t>
+        <w:t xml:space="preserve">Título del documento en una o dos líneas</w:t>
       </w:r>
     </w:p>
     <w:p>
       <w:pPr>
-        <w:spacing w:after="520" w:before="520"/>
-      </w:pPr>
-      <w:r>
-        <w:drawing>
-          <wp:inline distT="0" distB="0" distL="0" distR="0">
-            <wp:extent cx="6115050" cy="4000500"/>
-            <wp:effectExtent t="0" r="0" b="0" l="0"/>
-            <wp:docPr id="2" name=""/>
-            <wp:cNvGraphicFramePr>
-              <a:graphicFrameLocks xmlns:a="http://schemas.openxmlformats.org/drawingml/2006/main" noChangeAspect="1"/>
-            </wp:cNvGraphicFramePr>
-            <a:graphic xmlns:a="http://schemas.openxmlformats.org/drawingml/2006/main">
-              <a:graphicData uri="http://schemas.openxmlformats.org/drawingml/2006/picture">
-                <pic:pic xmlns:pic="http://schemas.openxmlformats.org/drawingml/2006/picture">
-                  <pic:nvPicPr>
-                    <pic:cNvPr id="0" name="" descr=""/>
-                    <pic:cNvPicPr>
-                      <a:picLocks noChangeAspect="1" noChangeArrowheads="1"/>
-                    </pic:cNvPicPr>
-                  </pic:nvPicPr>
-                  <pic:blipFill>
-                    <a:blip r:embed="rId12" cstate="none"/>
-                    <a:srcRect/>
-                    <a:stretch>
-                      <a:fillRect/>
-                    </a:stretch>
-                  </pic:blipFill>
-                  <pic:spPr bwMode="auto">
-                    <a:xfrm>
-                      <a:off x="0" y="0"/>
-                      <a:ext cx="6115050" cy="4000500"/>
-                    </a:xfrm>
-                    <a:prstGeom prst="rect">
-                      <a:avLst/>
-                    </a:prstGeom>
-                  </pic:spPr>
-                </pic:pic>
-              </a:graphicData>
-            </a:graphic>
-          </wp:inline>
-        </w:drawing>
-      </w:r>
-    </w:p>
-    <w:p>
-      <w:pPr>
-        <w:pBdr>
-          <w:top w:val="single" w:color="E8E8E6" w:sz="4" w:space="10"/>
-        </w:pBdr>
-        <w:spacing w:after="0" w:before="200"/>
+        <w:pStyle w:val="Subtitulo"/>
         <w:sectPr>
           <w:headerReference w:type="default" r:id="rId6"/>
           <w:footerReference w:type="default" r:id="rId7"/>
           <w:pgSz w:w="11906" w:h="16838" w:orient="portrait"/>
-          <w:pgMar w:top="1418" w:right="1134" w:bottom="1134" w:left="1134" w:header="567" w:footer="567" w:gutter="0"/>
+          <w:pgMar w:top="1701" w:right="1418" w:bottom="1985" w:left="1418" w:header="709" w:footer="1134" w:gutter="0"/>
           <w:pgNumType/>
           <w:docGrid w:linePitch="360"/>
         </w:sectPr>
       </w:pPr>
       <w:r>
-        <w:rPr>
-          <w:b/>
-          <w:bCs/>
-          <w:color w:val="506718"/>
-          <w:spacing w:val="30"/>
-          <w:sz w:val="14"/>
-          <w:szCs w:val="14"/>
-        </w:rPr>
-        <w:t xml:space="preserve">AUTOR  </w:t>
-      </w:r>
-      <w:r>
-        <w:rPr>
-          <w:color w:val="2E2E2D"/>
-          <w:sz w:val="17"/>
-          <w:szCs w:val="17"/>
-        </w:rPr>
-        <w:t xml:space="preserve">Nombre Apellido</w:t>
-      </w:r>
-      <w:r>
-        <w:t xml:space="preserve">      </w:t>
-      </w:r>
-      <w:r>
-        <w:rPr>
-          <w:b/>
-          <w:bCs/>
-          <w:color w:val="506718"/>
-          <w:spacing w:val="30"/>
-          <w:sz w:val="14"/>
-          <w:szCs w:val="14"/>
-        </w:rPr>
-        <w:t xml:space="preserve">ÁREA  </w:t>
-      </w:r>
-      <w:r>
-        <w:rPr>
-          <w:color w:val="2E2E2D"/>
-          <w:sz w:val="17"/>
-          <w:szCs w:val="17"/>
-        </w:rPr>
-        <w:t xml:space="preserve">Marketing</w:t>
-      </w:r>
-      <w:r>
-        <w:t xml:space="preserve">      </w:t>
-      </w:r>
-      <w:r>
-        <w:rPr>
-          <w:b/>
-          <w:bCs/>
-          <w:color w:val="506718"/>
-          <w:spacing w:val="30"/>
-          <w:sz w:val="14"/>
-          <w:szCs w:val="14"/>
-        </w:rPr>
-        <w:t xml:space="preserve">FECHA  </w:t>
-      </w:r>
-      <w:r>
-        <w:rPr>
-          <w:color w:val="2E2E2D"/>
-          <w:sz w:val="17"/>
-          <w:szCs w:val="17"/>
-        </w:rPr>
-        <w:t xml:space="preserve">dd/mm/aaaa</w:t>
-      </w:r>
-      <w:r>
-        <w:t xml:space="preserve">      </w:t>
-      </w:r>
-      <w:r>
-        <w:rPr>
-          <w:b/>
-          <w:bCs/>
-          <w:color w:val="506718"/>
-          <w:spacing w:val="30"/>
-          <w:sz w:val="14"/>
-          <w:szCs w:val="14"/>
-        </w:rPr>
-        <w:t xml:space="preserve">VERSIÓN  </w:t>
-      </w:r>
-      <w:r>
-        <w:rPr>
-          <w:color w:val="2E2E2D"/>
-          <w:sz w:val="17"/>
-          <w:szCs w:val="17"/>
-        </w:rPr>
-        <w:t xml:space="preserve">1.0</w:t>
+        <w:t xml:space="preserve">Subtítulo o descripción breve del contenido del documento.</w:t>
       </w:r>
     </w:p>
     <w:p>
@@ -230,7 +105,7 @@
         <w:pStyle w:val="Antetitulo"/>
       </w:pPr>
       <w:r>
-        <w:t xml:space="preserve">Apartado 01</w:t>
+        <w:t xml:space="preserve">Capítulo 01</w:t>
       </w:r>
     </w:p>
     <w:p>
@@ -250,7 +125,7 @@
       <w:headerReference w:type="default" r:id="rId8"/>
       <w:footerReference w:type="default" r:id="rId9"/>
       <w:pgSz w:w="11906" w:h="16838" w:orient="portrait"/>
-      <w:pgMar w:top="1418" w:right="1134" w:bottom="1134" w:left="1134" w:header="567" w:footer="567" w:gutter="0"/>
+      <w:pgMar w:top="1701" w:right="1418" w:bottom="1418" w:left="1418" w:header="709" w:footer="709" w:gutter="0"/>
       <w:pgNumType/>
       <w:docGrid w:linePitch="360"/>
     </w:sectPr>
@@ -297,10 +172,171 @@
 
 <file path=word/footer1.xml><?xml version="1.0" encoding="utf-8"?>
 <w:ftr xmlns:wpc="http://schemas.microsoft.com/office/word/2010/wordprocessingCanvas" xmlns:mc="http://schemas.openxmlformats.org/markup-compatibility/2006" xmlns:o="urn:schemas-microsoft-com:office:office" xmlns:r="http://schemas.openxmlformats.org/officeDocument/2006/relationships" xmlns:m="http://schemas.openxmlformats.org/officeDocument/2006/math" xmlns:v="urn:schemas-microsoft-com:vml" xmlns:wp14="http://schemas.microsoft.com/office/word/2010/wordprocessingDrawing" xmlns:wp="http://schemas.openxmlformats.org/drawingml/2006/wordprocessingDrawing" xmlns:w10="urn:schemas-microsoft-com:office:word" xmlns:w="http://schemas.openxmlformats.org/wordprocessingml/2006/main" xmlns:w14="http://schemas.microsoft.com/office/word/2010/wordml" xmlns:w15="http://schemas.microsoft.com/office/word/2012/wordml" xmlns:wpg="http://schemas.microsoft.com/office/word/2010/wordprocessingGroup" xmlns:wpi="http://schemas.microsoft.com/office/word/2010/wordprocessingInk" xmlns:wne="http://schemas.microsoft.com/office/word/2006/wordml" xmlns:wps="http://schemas.microsoft.com/office/word/2010/wordprocessingShape">
+  <w:tbl>
+    <w:tblPr>
+      <w:tblW w:type="dxa" w:w="9070"/>
+      <w:tblBorders>
+        <w:top w:val="none" w:color="FFFFFF" w:sz="0"/>
+        <w:left w:val="none" w:color="FFFFFF" w:sz="0"/>
+        <w:bottom w:val="none" w:color="FFFFFF" w:sz="0"/>
+        <w:right w:val="none" w:color="FFFFFF" w:sz="0"/>
+        <w:insideH w:val="none" w:color="FFFFFF" w:sz="0"/>
+        <w:insideV w:val="none" w:color="FFFFFF" w:sz="0"/>
+      </w:tblBorders>
+      <w:tblLayout w:type="fixed"/>
+    </w:tblPr>
+    <w:tblGrid>
+      <w:gridCol w:w="2267"/>
+      <w:gridCol w:w="2267"/>
+      <w:gridCol w:w="2267"/>
+      <w:gridCol w:w="2267"/>
+    </w:tblGrid>
+    <w:tr>
+      <w:trPr>
+        <w:cantSplit/>
+      </w:trPr>
+      <w:tc>
+        <w:tcPr>
+          <w:tcW w:type="dxa" w:w="2267"/>
+          <w:tcBorders>
+            <w:top w:val="single" w:color="2E2E2D" w:sz="6"/>
+            <w:left w:val="none" w:color="FFFFFF" w:sz="0"/>
+            <w:bottom w:val="none" w:color="FFFFFF" w:sz="0"/>
+            <w:right w:val="none" w:color="FFFFFF" w:sz="0"/>
+          </w:tcBorders>
+          <w:tcMar>
+            <w:top w:type="dxa" w:w="160"/>
+            <w:left w:type="dxa" w:w="0"/>
+            <w:bottom w:type="dxa" w:w="0"/>
+            <w:right w:type="dxa" w:w="200"/>
+          </w:tcMar>
+          <w:vAlign w:val="top"/>
+        </w:tcPr>
+        <w:p>
+          <w:pPr>
+            <w:pStyle w:val="MetaEtiqueta"/>
+          </w:pPr>
+          <w:r>
+            <w:t xml:space="preserve">Autor</w:t>
+          </w:r>
+        </w:p>
+        <w:p>
+          <w:pPr>
+            <w:pStyle w:val="MetaValor"/>
+          </w:pPr>
+          <w:r>
+            <w:t xml:space="preserve">Nombre Apellido</w:t>
+          </w:r>
+        </w:p>
+      </w:tc>
+      <w:tc>
+        <w:tcPr>
+          <w:tcW w:type="dxa" w:w="2267"/>
+          <w:tcBorders>
+            <w:top w:val="single" w:color="2E2E2D" w:sz="6"/>
+            <w:left w:val="none" w:color="FFFFFF" w:sz="0"/>
+            <w:bottom w:val="none" w:color="FFFFFF" w:sz="0"/>
+            <w:right w:val="none" w:color="FFFFFF" w:sz="0"/>
+          </w:tcBorders>
+          <w:tcMar>
+            <w:top w:type="dxa" w:w="160"/>
+            <w:left w:type="dxa" w:w="0"/>
+            <w:bottom w:type="dxa" w:w="0"/>
+            <w:right w:type="dxa" w:w="200"/>
+          </w:tcMar>
+          <w:vAlign w:val="top"/>
+        </w:tcPr>
+        <w:p>
+          <w:pPr>
+            <w:pStyle w:val="MetaEtiqueta"/>
+          </w:pPr>
+          <w:r>
+            <w:t xml:space="preserve">Área</w:t>
+          </w:r>
+        </w:p>
+        <w:p>
+          <w:pPr>
+            <w:pStyle w:val="MetaValor"/>
+          </w:pPr>
+          <w:r>
+            <w:t xml:space="preserve">Marketing</w:t>
+          </w:r>
+        </w:p>
+      </w:tc>
+      <w:tc>
+        <w:tcPr>
+          <w:tcW w:type="dxa" w:w="2267"/>
+          <w:tcBorders>
+            <w:top w:val="single" w:color="2E2E2D" w:sz="6"/>
+            <w:left w:val="none" w:color="FFFFFF" w:sz="0"/>
+            <w:bottom w:val="none" w:color="FFFFFF" w:sz="0"/>
+            <w:right w:val="none" w:color="FFFFFF" w:sz="0"/>
+          </w:tcBorders>
+          <w:tcMar>
+            <w:top w:type="dxa" w:w="160"/>
+            <w:left w:type="dxa" w:w="0"/>
+            <w:bottom w:type="dxa" w:w="0"/>
+            <w:right w:type="dxa" w:w="200"/>
+          </w:tcMar>
+          <w:vAlign w:val="top"/>
+        </w:tcPr>
+        <w:p>
+          <w:pPr>
+            <w:pStyle w:val="MetaEtiqueta"/>
+          </w:pPr>
+          <w:r>
+            <w:t xml:space="preserve">Fecha</w:t>
+          </w:r>
+        </w:p>
+        <w:p>
+          <w:pPr>
+            <w:pStyle w:val="MetaValor"/>
+          </w:pPr>
+          <w:r>
+            <w:t xml:space="preserve">dd/mm/aaaa</w:t>
+          </w:r>
+        </w:p>
+      </w:tc>
+      <w:tc>
+        <w:tcPr>
+          <w:tcW w:type="dxa" w:w="2267"/>
+          <w:tcBorders>
+            <w:top w:val="single" w:color="2E2E2D" w:sz="6"/>
+            <w:left w:val="none" w:color="FFFFFF" w:sz="0"/>
+            <w:bottom w:val="none" w:color="FFFFFF" w:sz="0"/>
+            <w:right w:val="none" w:color="FFFFFF" w:sz="0"/>
+          </w:tcBorders>
+          <w:tcMar>
+            <w:top w:type="dxa" w:w="160"/>
+            <w:left w:type="dxa" w:w="0"/>
+            <w:bottom w:type="dxa" w:w="0"/>
+            <w:right w:type="dxa" w:w="200"/>
+          </w:tcMar>
+          <w:vAlign w:val="top"/>
+        </w:tcPr>
+        <w:p>
+          <w:pPr>
+            <w:pStyle w:val="MetaEtiqueta"/>
+          </w:pPr>
+          <w:r>
+            <w:t xml:space="preserve">Versión</w:t>
+          </w:r>
+        </w:p>
+        <w:p>
+          <w:pPr>
+            <w:pStyle w:val="MetaValor"/>
+          </w:pPr>
+          <w:r>
+            <w:t xml:space="preserve">1.0</w:t>
+          </w:r>
+        </w:p>
+      </w:tc>
+    </w:tr>
+  </w:tbl>
   <w:p>
-    <w:r>
-      <w:t xml:space="preserve"/>
-    </w:r>
+    <w:pPr>
+      <w:spacing w:after="0"/>
+    </w:pPr>
   </w:p>
 </w:ftr>
 </file>
@@ -310,14 +346,14 @@
   <w:p>
     <w:pPr>
       <w:tabs>
-        <w:tab w:val="right" w:pos="9638"/>
+        <w:tab w:val="right" w:pos="9070"/>
       </w:tabs>
     </w:pPr>
     <w:r>
       <w:rPr>
         <w:color w:val="6F6F6E"/>
-        <w:sz w:val="15"/>
-        <w:szCs w:val="15"/>
+        <w:sz w:val="14"/>
+        <w:szCs w:val="14"/>
       </w:rPr>
       <w:t xml:space="preserve">santiagoways.com</w:t>
     </w:r>
@@ -328,9 +364,9 @@
       <w:rPr>
         <w:b/>
         <w:bCs/>
-        <w:color w:val="506718"/>
-        <w:sz w:val="16"/>
-        <w:szCs w:val="16"/>
+        <w:color w:val="2E2E2D"/>
+        <w:sz w:val="15"/>
+        <w:szCs w:val="15"/>
       </w:rPr>
       <w:fldChar w:fldCharType="begin"/>
     </w:r>
@@ -338,9 +374,9 @@
       <w:rPr>
         <w:b/>
         <w:bCs/>
-        <w:color w:val="506718"/>
-        <w:sz w:val="16"/>
-        <w:szCs w:val="16"/>
+        <w:color w:val="2E2E2D"/>
+        <w:sz w:val="15"/>
+        <w:szCs w:val="15"/>
       </w:rPr>
       <w:instrText xml:space="preserve">PAGE</w:instrText>
     </w:r>
@@ -348,9 +384,9 @@
       <w:rPr>
         <w:b/>
         <w:bCs/>
-        <w:color w:val="506718"/>
-        <w:sz w:val="16"/>
-        <w:szCs w:val="16"/>
+        <w:color w:val="2E2E2D"/>
+        <w:sz w:val="15"/>
+        <w:szCs w:val="15"/>
       </w:rPr>
       <w:fldChar w:fldCharType="separate"/>
     </w:r>
@@ -358,9 +394,9 @@
       <w:rPr>
         <w:b/>
         <w:bCs/>
-        <w:color w:val="506718"/>
-        <w:sz w:val="16"/>
-        <w:szCs w:val="16"/>
+        <w:color w:val="2E2E2D"/>
+        <w:sz w:val="15"/>
+        <w:szCs w:val="15"/>
       </w:rPr>
       <w:fldChar w:fldCharType="end"/>
     </w:r>
@@ -420,19 +456,19 @@
   <w:p>
     <w:pPr>
       <w:pBdr>
-        <w:bottom w:val="single" w:color="E8E8E6" w:sz="4" w:space="8"/>
+        <w:bottom w:val="single" w:color="E8E8E6" w:sz="4" w:space="10"/>
       </w:pBdr>
       <w:tabs>
-        <w:tab w:val="right" w:pos="9638"/>
+        <w:tab w:val="right" w:pos="9070"/>
       </w:tabs>
       <w:spacing w:after="0"/>
     </w:pPr>
     <w:r>
       <w:drawing>
         <wp:inline distT="0" distB="0" distL="0" distR="0">
-          <wp:extent cx="1190625" cy="190500"/>
+          <wp:extent cx="1047750" cy="171450"/>
           <wp:effectExtent t="0" r="0" b="0" l="0"/>
-          <wp:docPr id="3" name=""/>
+          <wp:docPr id="7" name=""/>
           <wp:cNvGraphicFramePr>
             <a:graphicFrameLocks xmlns:a="http://schemas.openxmlformats.org/drawingml/2006/main" noChangeAspect="1"/>
           </wp:cNvGraphicFramePr>
@@ -455,7 +491,7 @@
                 <pic:spPr bwMode="auto">
                   <a:xfrm>
                     <a:off x="0" y="0"/>
-                    <a:ext cx="1190625" cy="190500"/>
+                    <a:ext cx="1047750" cy="171450"/>
                   </a:xfrm>
                   <a:prstGeom prst="rect">
                     <a:avLst/>
@@ -473,8 +509,8 @@
     <w:r>
       <w:rPr>
         <w:color w:val="6F6F6E"/>
-        <w:sz w:val="15"/>
-        <w:szCs w:val="15"/>
+        <w:sz w:val="14"/>
+        <w:szCs w:val="14"/>
       </w:rPr>
       <w:t xml:space="preserve">Título del documento</w:t>
     </w:r>
@@ -573,31 +609,16 @@
     <w:lvl w:ilvl="0" w:tentative="1">
       <w:start w:val="1"/>
       <w:numFmt w:val="bullet"/>
-      <w:lvlText w:val="●"/>
+      <w:lvlText w:val="•"/>
       <w:lvlJc w:val="left"/>
       <w:pPr>
-        <w:ind w:left="400" w:hanging="300"/>
+        <w:ind w:left="340" w:hanging="340"/>
       </w:pPr>
       <w:rPr>
         <w:rFonts w:ascii="Arial" w:cs="Arial" w:eastAsia="Arial" w:hAnsi="Arial"/>
         <w:color w:val="7AA606"/>
-        <w:sz w:val="16"/>
-        <w:szCs w:val="16"/>
-      </w:rPr>
-    </w:lvl>
-    <w:lvl w:ilvl="1" w:tentative="1">
-      <w:start w:val="1"/>
-      <w:numFmt w:val="bullet"/>
-      <w:lvlText w:val="●"/>
-      <w:lvlJc w:val="left"/>
-      <w:pPr>
-        <w:ind w:left="800" w:hanging="300"/>
-      </w:pPr>
-      <w:rPr>
-        <w:rFonts w:ascii="Arial" w:cs="Arial" w:eastAsia="Arial" w:hAnsi="Arial"/>
-        <w:color w:val="506718"/>
-        <w:sz w:val="12"/>
-        <w:szCs w:val="12"/>
+        <w:sz w:val="20"/>
+        <w:szCs w:val="20"/>
       </w:rPr>
     </w:lvl>
   </w:abstractNum>
@@ -605,11 +626,29 @@
     <w:multiLevelType w:val="hybridMultilevel"/>
     <w:lvl w:ilvl="0" w:tentative="1">
       <w:start w:val="1"/>
+      <w:numFmt w:val="bullet"/>
+      <w:lvlText w:val="•"/>
+      <w:lvlJc w:val="left"/>
+      <w:pPr>
+        <w:ind w:left="340" w:hanging="340"/>
+      </w:pPr>
+      <w:rPr>
+        <w:rFonts w:ascii="Arial" w:cs="Arial" w:eastAsia="Arial" w:hAnsi="Arial"/>
+        <w:color w:val="6F6F6E"/>
+        <w:sz w:val="20"/>
+        <w:szCs w:val="20"/>
+      </w:rPr>
+    </w:lvl>
+  </w:abstractNum>
+  <w:abstractNum w:abstractNumId="4" w15:restartNumberingAfterBreak="0">
+    <w:multiLevelType w:val="hybridMultilevel"/>
+    <w:lvl w:ilvl="0" w:tentative="1">
+      <w:start w:val="1"/>
       <w:numFmt w:val="decimal"/>
       <w:lvlText w:val="%1."/>
       <w:lvlJc w:val="left"/>
       <w:pPr>
-        <w:ind w:left="400" w:hanging="400"/>
+        <w:ind w:left="340" w:hanging="340"/>
       </w:pPr>
       <w:rPr>
         <w:b/>
@@ -634,13 +673,13 @@
       <w:rPr>
         <w:rFonts w:ascii="Montserrat" w:cs="Montserrat" w:eastAsia="Montserrat" w:hAnsi="Montserrat"/>
         <w:color w:val="2E2E2D"/>
-        <w:sz w:val="21"/>
-        <w:szCs w:val="21"/>
+        <w:sz w:val="20"/>
+        <w:szCs w:val="20"/>
       </w:rPr>
     </w:rPrDefault>
     <w:pPrDefault>
       <w:pPr>
-        <w:spacing w:after="160" w:line="360" w:lineRule="auto"/>
+        <w:spacing w:after="160" w:before="0" w:line="348" w:lineRule="auto"/>
       </w:pPr>
     </w:pPrDefault>
   </w:docDefaults>
@@ -669,13 +708,13 @@
     <w:next w:val="Normal"/>
     <w:qFormat/>
     <w:pPr>
-      <w:spacing w:after="240" w:before="0" w:line="276" w:lineRule="auto"/>
+      <w:spacing w:after="240" w:before="0" w:line="252" w:lineRule="auto"/>
     </w:pPr>
     <w:rPr>
       <w:rFonts w:ascii="Montserrat ExtraBold" w:cs="Montserrat ExtraBold" w:eastAsia="Montserrat ExtraBold" w:hAnsi="Montserrat ExtraBold"/>
       <w:color w:val="2E2E2D"/>
-      <w:sz w:val="80"/>
-      <w:szCs w:val="80"/>
+      <w:sz w:val="72"/>
+      <w:szCs w:val="72"/>
     </w:rPr>
   </w:style>
   <w:style w:type="paragraph" w:styleId="Heading1">
@@ -685,7 +724,7 @@
     <w:qFormat/>
     <w:pPr>
       <w:keepNext/>
-      <w:spacing w:after="240" w:before="120" w:line="276" w:lineRule="auto"/>
+      <w:spacing w:after="280" w:before="0" w:line="252" w:lineRule="auto"/>
     </w:pPr>
     <w:rPr>
       <w:rFonts w:ascii="Montserrat ExtraBold" w:cs="Montserrat ExtraBold" w:eastAsia="Montserrat ExtraBold" w:hAnsi="Montserrat ExtraBold"/>
@@ -701,13 +740,13 @@
     <w:qFormat/>
     <w:pPr>
       <w:keepNext/>
-      <w:spacing w:after="160" w:before="360" w:line="276" w:lineRule="auto"/>
+      <w:spacing w:after="140" w:before="360" w:line="264" w:lineRule="auto"/>
     </w:pPr>
     <w:rPr>
       <w:rFonts w:ascii="Montserrat ExtraBold" w:cs="Montserrat ExtraBold" w:eastAsia="Montserrat ExtraBold" w:hAnsi="Montserrat ExtraBold"/>
       <w:color w:val="2E2E2D"/>
-      <w:sz w:val="40"/>
-      <w:szCs w:val="40"/>
+      <w:sz w:val="32"/>
+      <w:szCs w:val="32"/>
     </w:rPr>
   </w:style>
   <w:style w:type="paragraph" w:styleId="Heading3">
@@ -717,25 +756,7 @@
     <w:qFormat/>
     <w:pPr>
       <w:keepNext/>
-      <w:spacing w:after="120" w:before="280" w:line="276" w:lineRule="auto"/>
-    </w:pPr>
-    <w:rPr>
-      <w:rFonts w:ascii="Montserrat" w:cs="Montserrat" w:eastAsia="Montserrat" w:hAnsi="Montserrat"/>
-      <w:b/>
-      <w:bCs/>
-      <w:color w:val="506718"/>
-      <w:sz w:val="28"/>
-      <w:szCs w:val="28"/>
-    </w:rPr>
-  </w:style>
-  <w:style w:type="paragraph" w:styleId="Heading4">
-    <w:name w:val="Heading 4"/>
-    <w:basedOn w:val="Normal"/>
-    <w:next w:val="Normal"/>
-    <w:qFormat/>
-    <w:pPr>
-      <w:keepNext/>
-      <w:spacing w:after="80" w:before="200"/>
+      <w:spacing w:after="100" w:before="280" w:line="276" w:lineRule="auto"/>
     </w:pPr>
     <w:rPr>
       <w:rFonts w:ascii="Montserrat" w:cs="Montserrat" w:eastAsia="Montserrat" w:hAnsi="Montserrat"/>
@@ -746,6 +767,17 @@
       <w:szCs w:val="24"/>
     </w:rPr>
   </w:style>
+  <w:style w:type="paragraph" w:styleId="Heading4">
+    <w:name w:val="Heading 4"/>
+    <w:basedOn w:val="Normal"/>
+    <w:next w:val="Normal"/>
+    <w:qFormat/>
+    <w:rPr>
+      <w:i/>
+      <w:iCs/>
+      <w:color w:val="2E74B5"/>
+    </w:rPr>
+  </w:style>
   <w:style w:type="paragraph" w:styleId="Heading5">
     <w:name w:val="Heading 5"/>
     <w:basedOn w:val="Normal"/>
@@ -780,8 +812,8 @@
     <w:qFormat/>
     <w:rPr>
       <w:rFonts w:ascii="Montserrat" w:cs="Montserrat" w:eastAsia="Montserrat" w:hAnsi="Montserrat"/>
-      <w:sz w:val="21"/>
-      <w:szCs w:val="21"/>
+      <w:sz w:val="20"/>
+      <w:szCs w:val="20"/>
     </w:rPr>
   </w:style>
   <w:style w:type="character" w:styleId="Hyperlink">
@@ -875,7 +907,7 @@
     <w:qFormat/>
     <w:pPr>
       <w:keepNext/>
-      <w:spacing w:after="100" w:before="0" w:line="240" w:lineRule="auto"/>
+      <w:spacing w:after="160" w:before="0" w:line="240" w:lineRule="auto"/>
     </w:pPr>
     <w:rPr>
       <w:rFonts w:ascii="Montserrat" w:cs="Montserrat" w:eastAsia="Montserrat" w:hAnsi="Montserrat"/>
@@ -884,130 +916,365 @@
       <w:caps/>
       <w:color w:val="506718"/>
       <w:spacing w:val="30"/>
+      <w:sz w:val="15"/>
+      <w:szCs w:val="15"/>
+    </w:rPr>
+  </w:style>
+  <w:style w:type="paragraph" w:styleId="Subtitulo">
+    <w:name w:val="Subtítulo SW"/>
+    <w:basedOn w:val="Normal"/>
+    <w:next w:val="Normal"/>
+    <w:qFormat/>
+    <w:pPr>
+      <w:spacing w:after="0" w:before="0" w:line="312" w:lineRule="auto"/>
+    </w:pPr>
+    <w:rPr>
+      <w:rFonts w:ascii="Montserrat" w:cs="Montserrat" w:eastAsia="Montserrat" w:hAnsi="Montserrat"/>
+      <w:color w:val="6F6F6E"/>
+      <w:sz w:val="26"/>
+      <w:szCs w:val="26"/>
+    </w:rPr>
+  </w:style>
+  <w:style w:type="paragraph" w:styleId="Entradilla">
+    <w:name w:val="Entradilla"/>
+    <w:basedOn w:val="Normal"/>
+    <w:next w:val="Normal"/>
+    <w:qFormat/>
+    <w:pPr>
+      <w:spacing w:after="280" w:before="0" w:line="336" w:lineRule="auto"/>
+    </w:pPr>
+    <w:rPr>
+      <w:rFonts w:ascii="Montserrat" w:cs="Montserrat" w:eastAsia="Montserrat" w:hAnsi="Montserrat"/>
+      <w:color w:val="2E2E2D"/>
+      <w:sz w:val="25"/>
+      <w:szCs w:val="25"/>
+    </w:rPr>
+  </w:style>
+  <w:style w:type="paragraph" w:styleId="Lista">
+    <w:name w:val="Lista SW"/>
+    <w:basedOn w:val="Normal"/>
+    <w:next w:val="Normal"/>
+    <w:qFormat/>
+    <w:pPr>
+      <w:spacing w:after="80" w:before="0" w:line="300" w:lineRule="auto"/>
+    </w:pPr>
+    <w:rPr>
+      <w:rFonts w:ascii="Montserrat" w:cs="Montserrat" w:eastAsia="Montserrat" w:hAnsi="Montserrat"/>
+      <w:sz w:val="20"/>
+      <w:szCs w:val="20"/>
+    </w:rPr>
+  </w:style>
+  <w:style w:type="paragraph" w:styleId="CajaTexto">
+    <w:name w:val="Texto en caja"/>
+    <w:basedOn w:val="Normal"/>
+    <w:next w:val="Normal"/>
+    <w:qFormat/>
+    <w:pPr>
+      <w:spacing w:after="0" w:before="0" w:line="300" w:lineRule="auto"/>
+    </w:pPr>
+    <w:rPr>
+      <w:rFonts w:ascii="Montserrat" w:cs="Montserrat" w:eastAsia="Montserrat" w:hAnsi="Montserrat"/>
+      <w:sz w:val="19"/>
+      <w:szCs w:val="19"/>
+    </w:rPr>
+  </w:style>
+  <w:style w:type="paragraph" w:styleId="Cita">
+    <w:name w:val="Cita SW"/>
+    <w:basedOn w:val="Normal"/>
+    <w:next w:val="Normal"/>
+    <w:qFormat/>
+    <w:pPr>
+      <w:pBdr>
+        <w:top w:val="single" w:color="E8E8E6" w:sz="4" w:space="12"/>
+      </w:pBdr>
+      <w:spacing w:after="100" w:before="200" w:line="312" w:lineRule="auto"/>
+    </w:pPr>
+    <w:rPr>
+      <w:rFonts w:ascii="Montserrat" w:cs="Montserrat" w:eastAsia="Montserrat" w:hAnsi="Montserrat"/>
+      <w:b/>
+      <w:bCs/>
+      <w:color w:val="2E2E2D"/>
+      <w:sz w:val="28"/>
+      <w:szCs w:val="28"/>
+    </w:rPr>
+  </w:style>
+  <w:style w:type="paragraph" w:styleId="CitaAutor">
+    <w:name w:val="Autor de cita"/>
+    <w:basedOn w:val="Normal"/>
+    <w:next w:val="Normal"/>
+    <w:qFormat/>
+    <w:pPr>
+      <w:pBdr>
+        <w:bottom w:val="single" w:color="E8E8E6" w:sz="4" w:space="12"/>
+      </w:pBdr>
+      <w:spacing w:after="240" w:before="0" w:line="240" w:lineRule="auto"/>
+    </w:pPr>
+    <w:rPr>
+      <w:rFonts w:ascii="Montserrat" w:cs="Montserrat" w:eastAsia="Montserrat" w:hAnsi="Montserrat"/>
+      <w:color w:val="6F6F6E"/>
       <w:sz w:val="16"/>
       <w:szCs w:val="16"/>
     </w:rPr>
   </w:style>
-  <w:style w:type="paragraph" w:styleId="Subtitulo">
-    <w:name w:val="Subtítulo SW"/>
-    <w:basedOn w:val="Normal"/>
-    <w:next w:val="Normal"/>
-    <w:qFormat/>
-    <w:pPr>
-      <w:spacing w:after="200" w:line="300" w:lineRule="auto"/>
+  <w:style w:type="paragraph" w:styleId="TablaCabecera">
+    <w:name w:val="Tabla cabecera"/>
+    <w:basedOn w:val="Normal"/>
+    <w:next w:val="Normal"/>
+    <w:qFormat/>
+    <w:pPr>
+      <w:spacing w:after="0" w:before="0" w:line="240" w:lineRule="auto"/>
+    </w:pPr>
+    <w:rPr>
+      <w:rFonts w:ascii="Montserrat" w:cs="Montserrat" w:eastAsia="Montserrat" w:hAnsi="Montserrat"/>
+      <w:b/>
+      <w:bCs/>
+      <w:caps/>
+      <w:color w:val="2E2E2D"/>
+      <w:spacing w:val="16"/>
+      <w:sz w:val="15"/>
+      <w:szCs w:val="15"/>
+    </w:rPr>
+  </w:style>
+  <w:style w:type="paragraph" w:styleId="TablaTexto">
+    <w:name w:val="Tabla texto"/>
+    <w:basedOn w:val="Normal"/>
+    <w:next w:val="Normal"/>
+    <w:qFormat/>
+    <w:pPr>
+      <w:spacing w:after="0" w:before="0" w:line="252" w:lineRule="auto"/>
+    </w:pPr>
+    <w:rPr>
+      <w:rFonts w:ascii="Montserrat" w:cs="Montserrat" w:eastAsia="Montserrat" w:hAnsi="Montserrat"/>
+      <w:sz w:val="18"/>
+      <w:szCs w:val="18"/>
+    </w:rPr>
+  </w:style>
+  <w:style w:type="paragraph" w:styleId="Leyenda">
+    <w:name w:val="Leyenda SW"/>
+    <w:basedOn w:val="Normal"/>
+    <w:next w:val="Normal"/>
+    <w:qFormat/>
+    <w:pPr>
+      <w:spacing w:after="80" w:before="0" w:line="240" w:lineRule="auto"/>
     </w:pPr>
     <w:rPr>
       <w:rFonts w:ascii="Montserrat" w:cs="Montserrat" w:eastAsia="Montserrat" w:hAnsi="Montserrat"/>
       <w:color w:val="6F6F6E"/>
-      <w:sz w:val="28"/>
-      <w:szCs w:val="28"/>
-    </w:rPr>
-  </w:style>
-  <w:style w:type="paragraph" w:styleId="Entradilla">
-    <w:name w:val="Entradilla"/>
-    <w:basedOn w:val="Normal"/>
-    <w:next w:val="Normal"/>
-    <w:qFormat/>
-    <w:pPr>
-      <w:spacing w:after="240" w:line="336" w:lineRule="auto"/>
-    </w:pPr>
-    <w:rPr>
-      <w:rFonts w:ascii="Montserrat" w:cs="Montserrat" w:eastAsia="Montserrat" w:hAnsi="Montserrat"/>
-      <w:color w:val="2E2E2D"/>
+      <w:sz w:val="15"/>
+      <w:szCs w:val="15"/>
+    </w:rPr>
+  </w:style>
+  <w:style w:type="paragraph" w:styleId="Legal">
+    <w:name w:val="Texto legal"/>
+    <w:basedOn w:val="Normal"/>
+    <w:next w:val="Normal"/>
+    <w:qFormat/>
+    <w:pPr>
+      <w:spacing w:after="0" w:before="0" w:line="240" w:lineRule="auto"/>
+    </w:pPr>
+    <w:rPr>
+      <w:rFonts w:ascii="Montserrat" w:cs="Montserrat" w:eastAsia="Montserrat" w:hAnsi="Montserrat"/>
+      <w:color w:val="6F6F6E"/>
+      <w:sz w:val="14"/>
+      <w:szCs w:val="14"/>
+    </w:rPr>
+  </w:style>
+  <w:style w:type="paragraph" w:styleId="MetaEtiqueta">
+    <w:name w:val="Portada etiqueta"/>
+    <w:basedOn w:val="Normal"/>
+    <w:next w:val="Normal"/>
+    <w:qFormat/>
+    <w:pPr>
+      <w:spacing w:after="40" w:before="0" w:line="240" w:lineRule="auto"/>
+    </w:pPr>
+    <w:rPr>
+      <w:rFonts w:ascii="Montserrat" w:cs="Montserrat" w:eastAsia="Montserrat" w:hAnsi="Montserrat"/>
+      <w:b/>
+      <w:bCs/>
+      <w:caps/>
+      <w:color w:val="6F6F6E"/>
+      <w:spacing w:val="24"/>
+      <w:sz w:val="13"/>
+      <w:szCs w:val="13"/>
+    </w:rPr>
+  </w:style>
+  <w:style w:type="paragraph" w:styleId="MetaValor">
+    <w:name w:val="Portada dato"/>
+    <w:basedOn w:val="Normal"/>
+    <w:next w:val="Normal"/>
+    <w:qFormat/>
+    <w:pPr>
+      <w:spacing w:after="0" w:before="0" w:line="240" w:lineRule="auto"/>
+    </w:pPr>
+    <w:rPr>
+      <w:rFonts w:ascii="Montserrat" w:cs="Montserrat" w:eastAsia="Montserrat" w:hAnsi="Montserrat"/>
+      <w:sz w:val="17"/>
+      <w:szCs w:val="17"/>
+    </w:rPr>
+  </w:style>
+  <w:style w:type="paragraph" w:styleId="IndiceNumero">
+    <w:name w:val="Índice número"/>
+    <w:basedOn w:val="Normal"/>
+    <w:next w:val="Normal"/>
+    <w:qFormat/>
+    <w:pPr>
+      <w:spacing w:after="0" w:before="0" w:line="240" w:lineRule="auto"/>
+    </w:pPr>
+    <w:rPr>
+      <w:rFonts w:ascii="Montserrat ExtraBold" w:cs="Montserrat ExtraBold" w:eastAsia="Montserrat ExtraBold" w:hAnsi="Montserrat ExtraBold"/>
+      <w:color w:val="506718"/>
       <w:sz w:val="26"/>
       <w:szCs w:val="26"/>
     </w:rPr>
   </w:style>
-  <w:style w:type="paragraph" w:styleId="Lista">
-    <w:name w:val="Lista SW"/>
-    <w:basedOn w:val="Normal"/>
-    <w:next w:val="Normal"/>
-    <w:qFormat/>
-    <w:pPr>
-      <w:spacing w:after="80" w:line="336" w:lineRule="auto"/>
-    </w:pPr>
-    <w:rPr>
-      <w:rFonts w:ascii="Montserrat" w:cs="Montserrat" w:eastAsia="Montserrat" w:hAnsi="Montserrat"/>
-      <w:sz w:val="21"/>
-      <w:szCs w:val="21"/>
-    </w:rPr>
-  </w:style>
-  <w:style w:type="paragraph" w:styleId="CajaTexto">
-    <w:name w:val="Texto en caja"/>
-    <w:basedOn w:val="Normal"/>
-    <w:next w:val="Normal"/>
-    <w:qFormat/>
-    <w:pPr>
-      <w:spacing w:after="0" w:line="312" w:lineRule="auto"/>
-    </w:pPr>
-    <w:rPr>
-      <w:rFonts w:ascii="Montserrat" w:cs="Montserrat" w:eastAsia="Montserrat" w:hAnsi="Montserrat"/>
-      <w:color w:val="2E2E2D"/>
-      <w:sz w:val="20"/>
-      <w:szCs w:val="20"/>
-    </w:rPr>
-  </w:style>
-  <w:style w:type="paragraph" w:styleId="DestacadoCifra">
-    <w:name w:val="Destacado cifra"/>
-    <w:basedOn w:val="Normal"/>
-    <w:next w:val="Normal"/>
-    <w:qFormat/>
-    <w:pPr>
-      <w:spacing w:after="60" w:line="240" w:lineRule="auto"/>
-    </w:pPr>
-    <w:rPr>
-      <w:rFonts w:ascii="Montserrat ExtraBold" w:cs="Montserrat ExtraBold" w:eastAsia="Montserrat ExtraBold" w:hAnsi="Montserrat ExtraBold"/>
-      <w:color w:val="FFFFFF"/>
-      <w:sz w:val="64"/>
-      <w:szCs w:val="64"/>
-    </w:rPr>
-  </w:style>
-  <w:style w:type="paragraph" w:styleId="DestacadoTexto">
-    <w:name w:val="Destacado texto"/>
-    <w:basedOn w:val="Normal"/>
-    <w:next w:val="Normal"/>
-    <w:qFormat/>
-    <w:pPr>
-      <w:spacing w:after="0" w:line="312" w:lineRule="auto"/>
+  <w:style w:type="paragraph" w:styleId="IndiceTitulo">
+    <w:name w:val="Índice título"/>
+    <w:basedOn w:val="Normal"/>
+    <w:next w:val="Normal"/>
+    <w:qFormat/>
+    <w:pPr>
+      <w:spacing w:after="40" w:before="0" w:line="252" w:lineRule="auto"/>
     </w:pPr>
     <w:rPr>
       <w:rFonts w:ascii="Montserrat" w:cs="Montserrat" w:eastAsia="Montserrat" w:hAnsi="Montserrat"/>
       <w:b/>
       <w:bCs/>
-      <w:color w:val="FFFFFF"/>
-      <w:sz w:val="22"/>
-      <w:szCs w:val="22"/>
-    </w:rPr>
-  </w:style>
-  <w:style w:type="paragraph" w:styleId="Cita">
-    <w:name w:val="Cita SW"/>
-    <w:basedOn w:val="Normal"/>
-    <w:next w:val="Normal"/>
-    <w:qFormat/>
-    <w:pPr>
-      <w:pBdr>
-        <w:left w:val="single" w:color="7AA606" w:sz="24" w:space="12"/>
-      </w:pBdr>
-      <w:spacing w:after="80" w:before="120" w:line="336" w:lineRule="auto"/>
-      <w:ind w:left="340"/>
+      <w:sz w:val="24"/>
+      <w:szCs w:val="24"/>
+    </w:rPr>
+  </w:style>
+  <w:style w:type="paragraph" w:styleId="IndiceTexto">
+    <w:name w:val="Índice texto"/>
+    <w:basedOn w:val="Normal"/>
+    <w:next w:val="Normal"/>
+    <w:qFormat/>
+    <w:pPr>
+      <w:spacing w:after="0" w:before="0" w:line="252" w:lineRule="auto"/>
+    </w:pPr>
+    <w:rPr>
+      <w:rFonts w:ascii="Montserrat" w:cs="Montserrat" w:eastAsia="Montserrat" w:hAnsi="Montserrat"/>
+      <w:color w:val="6F6F6E"/>
+      <w:sz w:val="17"/>
+      <w:szCs w:val="17"/>
+    </w:rPr>
+  </w:style>
+  <w:style w:type="paragraph" w:styleId="SeparadorNumero">
+    <w:name w:val="Separador número"/>
+    <w:basedOn w:val="Normal"/>
+    <w:next w:val="Normal"/>
+    <w:qFormat/>
+    <w:pPr>
+      <w:spacing w:after="200" w:before="0" w:line="240" w:lineRule="auto"/>
+    </w:pPr>
+    <w:rPr>
+      <w:rFonts w:ascii="Montserrat ExtraBold" w:cs="Montserrat ExtraBold" w:eastAsia="Montserrat ExtraBold" w:hAnsi="Montserrat ExtraBold"/>
+      <w:color w:val="506718"/>
+      <w:sz w:val="160"/>
+      <w:szCs w:val="160"/>
+    </w:rPr>
+  </w:style>
+  <w:style w:type="paragraph" w:styleId="CifraNumero">
+    <w:name w:val="Cifra"/>
+    <w:basedOn w:val="Normal"/>
+    <w:next w:val="Normal"/>
+    <w:qFormat/>
+    <w:pPr>
+      <w:spacing w:after="60" w:before="0" w:line="240" w:lineRule="auto"/>
+    </w:pPr>
+    <w:rPr>
+      <w:rFonts w:ascii="Montserrat ExtraBold" w:cs="Montserrat ExtraBold" w:eastAsia="Montserrat ExtraBold" w:hAnsi="Montserrat ExtraBold"/>
+      <w:color w:val="2E2E2D"/>
+      <w:sz w:val="44"/>
+      <w:szCs w:val="44"/>
+    </w:rPr>
+  </w:style>
+  <w:style w:type="paragraph" w:styleId="CifraTexto">
+    <w:name w:val="Cifra texto"/>
+    <w:basedOn w:val="Normal"/>
+    <w:next w:val="Normal"/>
+    <w:qFormat/>
+    <w:pPr>
+      <w:spacing w:after="0" w:before="0" w:line="252" w:lineRule="auto"/>
+    </w:pPr>
+    <w:rPr>
+      <w:rFonts w:ascii="Montserrat" w:cs="Montserrat" w:eastAsia="Montserrat" w:hAnsi="Montserrat"/>
+      <w:color w:val="6F6F6E"/>
+      <w:sz w:val="16"/>
+      <w:szCs w:val="16"/>
+    </w:rPr>
+  </w:style>
+  <w:style w:type="paragraph" w:styleId="BarraEtiqueta">
+    <w:name w:val="Barra etiqueta"/>
+    <w:basedOn w:val="Normal"/>
+    <w:next w:val="Normal"/>
+    <w:qFormat/>
+    <w:pPr>
+      <w:spacing w:after="0" w:before="0" w:line="240" w:lineRule="auto"/>
+    </w:pPr>
+    <w:rPr>
+      <w:rFonts w:ascii="Montserrat" w:cs="Montserrat" w:eastAsia="Montserrat" w:hAnsi="Montserrat"/>
+      <w:sz w:val="17"/>
+      <w:szCs w:val="17"/>
+    </w:rPr>
+  </w:style>
+  <w:style w:type="paragraph" w:styleId="BarraValor">
+    <w:name w:val="Barra valor"/>
+    <w:basedOn w:val="Normal"/>
+    <w:next w:val="Normal"/>
+    <w:qFormat/>
+    <w:pPr>
+      <w:spacing w:after="0" w:before="0" w:line="240" w:lineRule="auto"/>
+      <w:jc w:val="right"/>
+    </w:pPr>
+    <w:rPr>
+      <w:rFonts w:ascii="Montserrat" w:cs="Montserrat" w:eastAsia="Montserrat" w:hAnsi="Montserrat"/>
+      <w:b/>
+      <w:bCs/>
+      <w:sz w:val="17"/>
+      <w:szCs w:val="17"/>
+    </w:rPr>
+  </w:style>
+  <w:style w:type="paragraph" w:styleId="PasoNumero">
+    <w:name w:val="Paso número"/>
+    <w:basedOn w:val="Normal"/>
+    <w:next w:val="Normal"/>
+    <w:qFormat/>
+    <w:pPr>
+      <w:spacing w:after="80" w:before="0" w:line="240" w:lineRule="auto"/>
     </w:pPr>
     <w:rPr>
       <w:rFonts w:ascii="Montserrat" w:cs="Montserrat" w:eastAsia="Montserrat" w:hAnsi="Montserrat"/>
       <w:b/>
       <w:bCs/>
       <w:color w:val="506718"/>
-      <w:sz w:val="28"/>
-      <w:szCs w:val="28"/>
-    </w:rPr>
-  </w:style>
-  <w:style w:type="paragraph" w:styleId="CitaAutor">
-    <w:name w:val="Autor de cita"/>
-    <w:basedOn w:val="Normal"/>
-    <w:next w:val="Normal"/>
-    <w:qFormat/>
-    <w:pPr>
-      <w:spacing w:after="240"/>
-      <w:ind w:left="340"/>
+      <w:spacing w:val="20"/>
+      <w:sz w:val="16"/>
+      <w:szCs w:val="16"/>
+    </w:rPr>
+  </w:style>
+  <w:style w:type="paragraph" w:styleId="PasoTitulo">
+    <w:name w:val="Paso título"/>
+    <w:basedOn w:val="Normal"/>
+    <w:next w:val="Normal"/>
+    <w:qFormat/>
+    <w:pPr>
+      <w:spacing w:after="60" w:before="0" w:line="252" w:lineRule="auto"/>
+    </w:pPr>
+    <w:rPr>
+      <w:rFonts w:ascii="Montserrat" w:cs="Montserrat" w:eastAsia="Montserrat" w:hAnsi="Montserrat"/>
+      <w:b/>
+      <w:bCs/>
+      <w:sz w:val="20"/>
+      <w:szCs w:val="20"/>
+    </w:rPr>
+  </w:style>
+  <w:style w:type="paragraph" w:styleId="PasoTexto">
+    <w:name w:val="Paso texto"/>
+    <w:basedOn w:val="Normal"/>
+    <w:next w:val="Normal"/>
+    <w:qFormat/>
+    <w:pPr>
+      <w:spacing w:after="0" w:before="0" w:line="264" w:lineRule="auto"/>
     </w:pPr>
     <w:rPr>
       <w:rFonts w:ascii="Montserrat" w:cs="Montserrat" w:eastAsia="Montserrat" w:hAnsi="Montserrat"/>
@@ -1016,66 +1283,81 @@
       <w:szCs w:val="17"/>
     </w:rPr>
   </w:style>
-  <w:style w:type="paragraph" w:styleId="TablaCabecera">
-    <w:name w:val="Tabla cabecera"/>
-    <w:basedOn w:val="Normal"/>
-    <w:next w:val="Normal"/>
-    <w:qFormat/>
-    <w:pPr>
-      <w:spacing w:after="0" w:line="240" w:lineRule="auto"/>
+  <w:style w:type="paragraph" w:styleId="IdeaNumero">
+    <w:name w:val="Idea número"/>
+    <w:basedOn w:val="Normal"/>
+    <w:next w:val="Normal"/>
+    <w:qFormat/>
+    <w:pPr>
+      <w:spacing w:after="0" w:before="0" w:line="240" w:lineRule="auto"/>
+    </w:pPr>
+    <w:rPr>
+      <w:rFonts w:ascii="Montserrat ExtraBold" w:cs="Montserrat ExtraBold" w:eastAsia="Montserrat ExtraBold" w:hAnsi="Montserrat ExtraBold"/>
+      <w:color w:val="506718"/>
+      <w:sz w:val="36"/>
+      <w:szCs w:val="36"/>
+    </w:rPr>
+  </w:style>
+  <w:style w:type="paragraph" w:styleId="IdeaTitulo">
+    <w:name w:val="Idea título"/>
+    <w:basedOn w:val="Normal"/>
+    <w:next w:val="Normal"/>
+    <w:qFormat/>
+    <w:pPr>
+      <w:spacing w:after="40" w:before="0" w:line="252" w:lineRule="auto"/>
     </w:pPr>
     <w:rPr>
       <w:rFonts w:ascii="Montserrat" w:cs="Montserrat" w:eastAsia="Montserrat" w:hAnsi="Montserrat"/>
       <w:b/>
       <w:bCs/>
-      <w:color w:val="FFFFFF"/>
-      <w:sz w:val="17"/>
-      <w:szCs w:val="17"/>
-    </w:rPr>
-  </w:style>
-  <w:style w:type="paragraph" w:styleId="TablaTexto">
-    <w:name w:val="Tabla texto"/>
-    <w:basedOn w:val="Normal"/>
-    <w:next w:val="Normal"/>
-    <w:qFormat/>
-    <w:pPr>
-      <w:spacing w:after="0" w:line="264" w:lineRule="auto"/>
-    </w:pPr>
-    <w:rPr>
-      <w:rFonts w:ascii="Montserrat" w:cs="Montserrat" w:eastAsia="Montserrat" w:hAnsi="Montserrat"/>
-      <w:color w:val="2E2E2D"/>
+      <w:sz w:val="22"/>
+      <w:szCs w:val="22"/>
+    </w:rPr>
+  </w:style>
+  <w:style w:type="paragraph" w:styleId="IdeaTexto">
+    <w:name w:val="Idea texto"/>
+    <w:basedOn w:val="Normal"/>
+    <w:next w:val="Normal"/>
+    <w:qFormat/>
+    <w:pPr>
+      <w:spacing w:after="0" w:before="0" w:line="276" w:lineRule="auto"/>
+    </w:pPr>
+    <w:rPr>
+      <w:rFonts w:ascii="Montserrat" w:cs="Montserrat" w:eastAsia="Montserrat" w:hAnsi="Montserrat"/>
+      <w:color w:val="6F6F6E"/>
       <w:sz w:val="18"/>
       <w:szCs w:val="18"/>
     </w:rPr>
   </w:style>
-  <w:style w:type="paragraph" w:styleId="Leyenda">
-    <w:name w:val="Leyenda SW"/>
-    <w:basedOn w:val="Normal"/>
-    <w:next w:val="Normal"/>
-    <w:qFormat/>
-    <w:pPr>
-      <w:spacing w:after="100" w:line="240" w:lineRule="auto"/>
+  <w:style w:type="paragraph" w:styleId="ContraWeb">
+    <w:name w:val="Contraportada web"/>
+    <w:basedOn w:val="Normal"/>
+    <w:next w:val="Normal"/>
+    <w:qFormat/>
+    <w:pPr>
+      <w:spacing w:after="80" w:before="0" w:line="240" w:lineRule="auto"/>
+    </w:pPr>
+    <w:rPr>
+      <w:rFonts w:ascii="Montserrat" w:cs="Montserrat" w:eastAsia="Montserrat" w:hAnsi="Montserrat"/>
+      <w:b/>
+      <w:bCs/>
+      <w:sz w:val="22"/>
+      <w:szCs w:val="22"/>
+    </w:rPr>
+  </w:style>
+  <w:style w:type="paragraph" w:styleId="ContraTexto">
+    <w:name w:val="Contraportada texto"/>
+    <w:basedOn w:val="Normal"/>
+    <w:next w:val="Normal"/>
+    <w:qFormat/>
+    <w:pPr>
+      <w:spacing w:after="0" w:before="0" w:line="240" w:lineRule="auto"/>
     </w:pPr>
     <w:rPr>
       <w:rFonts w:ascii="Montserrat" w:cs="Montserrat" w:eastAsia="Montserrat" w:hAnsi="Montserrat"/>
       <w:color w:val="6F6F6E"/>
       <w:sz w:val="16"/>
       <w:szCs w:val="16"/>
-    </w:rPr>
-  </w:style>
-  <w:style w:type="paragraph" w:styleId="Legal">
-    <w:name w:val="Texto legal"/>
-    <w:basedOn w:val="Normal"/>
-    <w:next w:val="Normal"/>
-    <w:qFormat/>
-    <w:pPr>
-      <w:spacing w:after="0" w:line="240" w:lineRule="auto"/>
-    </w:pPr>
-    <w:rPr>
-      <w:rFonts w:ascii="Montserrat" w:cs="Montserrat" w:eastAsia="Montserrat" w:hAnsi="Montserrat"/>
-      <w:color w:val="6F6F6E"/>
-      <w:sz w:val="14"/>
-      <w:szCs w:val="14"/>
     </w:rPr>
   </w:style>
 </w:styles>

</xml_diff>

<commit_message>
Amplía la plantilla de Word a 19 páginas tipo y añade guía para IA
Portada 1 con el título algo más arriba; nuevas páginas de resumen,
itinerario, comparativa, plan de trabajo, testimonios, preguntas
frecuentes, presupuesto, equipo y carta; instrucciones para montar
documentos con IA a partir de la plantilla.

Co-Authored-By: Claude Opus 5.5 <noreply@anthropic.com>
Claude-Session: https://claude.ai/code/session_01VgtpFgEc7N9EFi63NUqpEw
</commit_message>
<xml_diff>
--- a/plantillas/word/Documento_en_blanco_Santiago_Ways.docx
+++ b/plantillas/word/Documento_en_blanco_Santiago_Ways.docx
@@ -49,7 +49,7 @@
     </w:p>
     <w:p>
       <w:pPr>
-        <w:spacing w:after="0" w:before="5400" w:line="240" w:lineRule="auto"/>
+        <w:spacing w:after="0" w:before="4300" w:line="240" w:lineRule="auto"/>
       </w:pPr>
       <w:r>
         <w:rPr>
@@ -1358,6 +1358,116 @@
       <w:color w:val="6F6F6E"/>
       <w:sz w:val="16"/>
       <w:szCs w:val="16"/>
+    </w:rPr>
+  </w:style>
+  <w:style w:type="paragraph" w:styleId="PlanNombre">
+    <w:name w:val="Plan nombre"/>
+    <w:basedOn w:val="Normal"/>
+    <w:next w:val="Normal"/>
+    <w:qFormat/>
+    <w:pPr>
+      <w:spacing w:after="20" w:before="0" w:line="240" w:lineRule="auto"/>
+    </w:pPr>
+    <w:rPr>
+      <w:rFonts w:ascii="Montserrat" w:cs="Montserrat" w:eastAsia="Montserrat" w:hAnsi="Montserrat"/>
+      <w:b/>
+      <w:bCs/>
+      <w:sz w:val="22"/>
+      <w:szCs w:val="22"/>
+    </w:rPr>
+  </w:style>
+  <w:style w:type="paragraph" w:styleId="PlanPrecio">
+    <w:name w:val="Plan precio"/>
+    <w:basedOn w:val="Normal"/>
+    <w:next w:val="Normal"/>
+    <w:qFormat/>
+    <w:pPr>
+      <w:spacing w:after="0" w:before="0" w:line="240" w:lineRule="auto"/>
+    </w:pPr>
+    <w:rPr>
+      <w:rFonts w:ascii="Montserrat" w:cs="Montserrat" w:eastAsia="Montserrat" w:hAnsi="Montserrat"/>
+      <w:color w:val="6F6F6E"/>
+      <w:sz w:val="16"/>
+      <w:szCs w:val="16"/>
+    </w:rPr>
+  </w:style>
+  <w:style w:type="paragraph" w:styleId="Celda">
+    <w:name w:val="Celda centrada"/>
+    <w:basedOn w:val="Normal"/>
+    <w:next w:val="Normal"/>
+    <w:qFormat/>
+    <w:pPr>
+      <w:spacing w:after="0" w:before="0" w:line="240" w:lineRule="auto"/>
+      <w:jc w:val="center"/>
+    </w:pPr>
+    <w:rPr>
+      <w:rFonts w:ascii="Montserrat" w:cs="Montserrat" w:eastAsia="Montserrat" w:hAnsi="Montserrat"/>
+      <w:sz w:val="18"/>
+      <w:szCs w:val="18"/>
+    </w:rPr>
+  </w:style>
+  <w:style w:type="paragraph" w:styleId="Pregunta">
+    <w:name w:val="Pregunta"/>
+    <w:basedOn w:val="Normal"/>
+    <w:next w:val="Normal"/>
+    <w:qFormat/>
+    <w:pPr>
+      <w:keepNext/>
+      <w:spacing w:after="80" w:before="0" w:line="276" w:lineRule="auto"/>
+    </w:pPr>
+    <w:rPr>
+      <w:rFonts w:ascii="Montserrat" w:cs="Montserrat" w:eastAsia="Montserrat" w:hAnsi="Montserrat"/>
+      <w:b/>
+      <w:bCs/>
+      <w:sz w:val="22"/>
+      <w:szCs w:val="22"/>
+    </w:rPr>
+  </w:style>
+  <w:style w:type="paragraph" w:styleId="TestimonioTexto">
+    <w:name w:val="Testimonio"/>
+    <w:basedOn w:val="Normal"/>
+    <w:next w:val="Normal"/>
+    <w:qFormat/>
+    <w:pPr>
+      <w:spacing w:after="160" w:before="0" w:line="300" w:lineRule="auto"/>
+    </w:pPr>
+    <w:rPr>
+      <w:rFonts w:ascii="Montserrat" w:cs="Montserrat" w:eastAsia="Montserrat" w:hAnsi="Montserrat"/>
+      <w:b/>
+      <w:bCs/>
+      <w:sz w:val="24"/>
+      <w:szCs w:val="24"/>
+    </w:rPr>
+  </w:style>
+  <w:style w:type="paragraph" w:styleId="TestimonioAutor">
+    <w:name w:val="Testimonio autor"/>
+    <w:basedOn w:val="Normal"/>
+    <w:next w:val="Normal"/>
+    <w:qFormat/>
+    <w:pPr>
+      <w:spacing w:after="0" w:before="0" w:line="240" w:lineRule="auto"/>
+    </w:pPr>
+    <w:rPr>
+      <w:rFonts w:ascii="Montserrat" w:cs="Montserrat" w:eastAsia="Montserrat" w:hAnsi="Montserrat"/>
+      <w:color w:val="6F6F6E"/>
+      <w:sz w:val="16"/>
+      <w:szCs w:val="16"/>
+    </w:rPr>
+  </w:style>
+  <w:style w:type="paragraph" w:styleId="CartaAsunto">
+    <w:name w:val="Carta asunto"/>
+    <w:basedOn w:val="Normal"/>
+    <w:next w:val="Normal"/>
+    <w:qFormat/>
+    <w:pPr>
+      <w:spacing w:after="280" w:before="0" w:line="300" w:lineRule="auto"/>
+    </w:pPr>
+    <w:rPr>
+      <w:rFonts w:ascii="Montserrat" w:cs="Montserrat" w:eastAsia="Montserrat" w:hAnsi="Montserrat"/>
+      <w:b/>
+      <w:bCs/>
+      <w:sz w:val="20"/>
+      <w:szCs w:val="20"/>
     </w:rPr>
   </w:style>
 </w:styles>

</xml_diff>

<commit_message>
Rediseña la contraportada de la plantilla de Word
Co-Authored-By: Claude Opus 5.5 <noreply@anthropic.com>
Claude-Session: https://claude.ai/code/session_01VgtpFgEc7N9EFi63NUqpEw
</commit_message>
<xml_diff>
--- a/plantillas/word/Documento_en_blanco_Santiago_Ways.docx
+++ b/plantillas/word/Documento_en_blanco_Santiago_Ways.docx
@@ -468,7 +468,7 @@
         <wp:inline distT="0" distB="0" distL="0" distR="0">
           <wp:extent cx="1047750" cy="171450"/>
           <wp:effectExtent t="0" r="0" b="0" l="0"/>
-          <wp:docPr id="7" name=""/>
+          <wp:docPr id="6" name=""/>
           <wp:cNvGraphicFramePr>
             <a:graphicFrameLocks xmlns:a="http://schemas.openxmlformats.org/drawingml/2006/main" noChangeAspect="1"/>
           </wp:cNvGraphicFramePr>
@@ -1358,6 +1358,21 @@
       <w:color w:val="6F6F6E"/>
       <w:sz w:val="16"/>
       <w:szCs w:val="16"/>
+    </w:rPr>
+  </w:style>
+  <w:style w:type="paragraph" w:styleId="Cierre">
+    <w:name w:val="Frase de cierre"/>
+    <w:basedOn w:val="Normal"/>
+    <w:next w:val="Normal"/>
+    <w:qFormat/>
+    <w:pPr>
+      <w:spacing w:after="240" w:before="0" w:line="252" w:lineRule="auto"/>
+    </w:pPr>
+    <w:rPr>
+      <w:rFonts w:ascii="Montserrat ExtraBold" w:cs="Montserrat ExtraBold" w:eastAsia="Montserrat ExtraBold" w:hAnsi="Montserrat ExtraBold"/>
+      <w:color w:val="2E2E2D"/>
+      <w:sz w:val="52"/>
+      <w:szCs w:val="52"/>
     </w:rPr>
   </w:style>
   <w:style w:type="paragraph" w:styleId="PlanNombre">

</xml_diff>